<commit_message>
docs(KAN-53): cập nhật 3.1.13 theo kết quả A4
- Hình 3.20: nhánh mã mất hiệu lực lúc đặt đơn đổi từ "từ chối đơn" sang
  "chọn mã thay thế, tính tổng mới, chờ khách xác nhận" (D1).
- Hình 3.19 và AD_VOUCHER_02: chín bước chấm mã, thêm bước sai danh mục.
- Thêm AD_VOUCHER_07 (mã theo danh mục, D4), AD_ORDER_05 (tổng mới lúc đặt
  đơn), AD_ORDER_06 (trả lượt đúng một lần).
- Tình huống 7 và 8 viết lại theo D1 và quy tắc trả lượt một lần; thêm tình
  huống 11 về giỏ hàng lẫn nhiều danh mục.
- Sinh lại .bpmn, .drawio, PNG và docx từ docs/ba/build.

Co-Authored-By: Claude Opus 5.5 <noreply@anthropic.com>
</commit_message>
<xml_diff>
--- a/docs/ba/Velura-3.1.13-Quy-trinh-khuyen-mai.docx
+++ b/docs/ba/Velura-3.1.13-Quy-trinh-khuyen-mai.docx
@@ -311,7 +311,7 @@
           <w:szCs w:val="26"/>
           <w:rtl w:val="0"/>
         </w:rPr>
-        <w:t>Phía khách hàng, Velura không lưu một bản sao mã riêng cho từng người. Khi khách mở giỏ hàng hoặc trang Ưu đãi, hệ thống lấy bộ mã đang hoạt động, lọc theo đối tượng rồi chấm từng mã trên giá trị giỏ hiện tại. Thứ tự chấm có chủ đích: các lý do thuộc về bản thân mã được xét trước, gồm mã ngừng hoạt động, chưa tới hạn, đã hết hạn và hết lượt toàn hệ thống; tiếp đó tới trạng thái chiến dịch cha, gồm tạm dừng, ngoài khung ngày và cạn ngân sách; rồi tới nhóm khách áp dụng; rồi tới số lượt chính khách đã dùng; cuối cùng mới tới giá trị đơn tối thiểu. Xếp như vậy để câu giải thích hiển thị cho khách nêu đúng nguyên nhân gốc, thay vì mời khách mua thêm hàng cho một mã vốn đã hết hạn. Mã chưa đủ điều kiện vẫn được hiển thị kèm lý do cụ thể và số tiền còn thiếu để đạt điều kiện.</w:t>
+        <w:t>Phía khách hàng, Velura không lưu một bản sao mã riêng cho từng người. Khi khách mở giỏ hàng hoặc trang Ưu đãi, hệ thống lấy bộ mã đang hoạt động, lọc theo đối tượng rồi chấm từng mã trên giá trị giỏ hiện tại. Thứ tự chấm có chủ đích: các lý do thuộc về bản thân mã được xét trước, gồm mã ngừng hoạt động, chưa tới hạn, đã hết hạn và hết lượt toàn hệ thống; tiếp đó tới trạng thái chiến dịch cha, gồm tạm dừng, ngoài khung ngày và cạn ngân sách; rồi tới nhóm khách áp dụng; rồi tới danh mục áp dụng; rồi tới số lượt chính khách đã dùng; cuối cùng mới tới giá trị đơn tối thiểu. Xếp như vậy để câu giải thích hiển thị cho khách nêu đúng nguyên nhân gốc, thay vì mời khách mua thêm hàng cho một mã vốn đã hết hạn. Mã chưa đủ điều kiện vẫn được hiển thị kèm lý do cụ thể và số tiền còn thiếu để đạt điều kiện. Mã khai danh mục áp dụng chỉ tính trên phần hàng thuộc danh mục đó, cả khi xét giá trị đơn tối thiểu lẫn khi tính số tiền giảm, và danh mục cha bao luôn các danh mục con. Giỏ hàng không có sản phẩm nào thuộc danh mục thì mã được báo là sai danh mục, không bị báo là đơn chưa đủ tiền.</w:t>
       </w:r>
     </w:p>
     <w:p>
@@ -427,7 +427,7 @@
           <w:szCs w:val="26"/>
           <w:rtl w:val="0"/>
         </w:rPr>
-        <w:t>Khi khách bấm đặt hàng, máy chủ tự tra bảng giá theo từng biến thể, tự cộng tạm tính, tự xác định phí vận chuyển theo ngưỡng và chấm lại mã một lần nữa tại đúng thời điểm đặt đơn. Toàn bộ số tiền do trình duyệt gửi lên đều bị bỏ qua. Nếu đơn giá trình duyệt khai lệch so với bảng giá, đơn bị từ chối và khách được yêu cầu tải lại giỏ, vì khoảng lệch đó thường là dấu hiệu giá vừa thay đổi trong lúc khách còn đang ở giỏ hàng. Lượt dùng mã và phần ngân sách tương ứng được ghi trong cùng một giao dịch có khoá dòng, nên hai đơn đặt gần như cùng lúc không ghi đè số lượt của nhau. Đơn bị huỷ thì cả lượt dùng lẫn phần ngân sách đã cộng được hoàn lại.</w:t>
+        <w:t>Khi khách bấm đặt hàng, máy chủ tự tra bảng giá theo từng biến thể, tự cộng tạm tính, tự xác định phí vận chuyển theo ngưỡng và chấm lại mã một lần nữa tại đúng thời điểm đặt đơn. Toàn bộ số tiền do trình duyệt gửi lên đều bị bỏ qua. Nếu đơn giá trình duyệt khai lệch so với bảng giá, đơn bị từ chối và khách được yêu cầu tải lại giỏ, vì khoảng lệch đó thường là dấu hiệu giá vừa thay đổi trong lúc khách còn đang ở giỏ hàng. Lượt dùng mã và phần ngân sách tương ứng được ghi trong cùng một giao dịch có khoá dòng, nên hai đơn đặt gần như cùng lúc không ghi đè số lượt của nhau. Nếu mã khách chọn vừa hết lượt hoặc hết hạn trong khoảng giữa lúc xem giỏ và lúc bấm đặt hàng, hệ thống không tạo đơn. Thay vào đó hệ thống chọn mã thay thế tốt nhất, tính lại tổng tiền và báo khách mã nào vừa mất hiệu lực; khách xác nhận tổng mới thì đơn mới được tạo. Cách làm này bảo đảm khách không bao giờ bị trừ tiền theo một con số khác với con số mình đã nhìn thấy. Đơn không thành, dù do khách huỷ, quản trị viên huỷ, hay phiên thanh toán trực tuyến hết hạn hoặc bị huỷ, đều được trả lại lượt dùng và phần ngân sách đã cộng. Mỗi đơn chỉ được trả đúng một lần, kể cả khi cùng một đơn đi qua nhiều đường kết thúc.</w:t>
       </w:r>
     </w:p>
     <w:p>
@@ -448,7 +448,7 @@
           <w:szCs w:val="26"/>
           <w:rtl w:val="0"/>
         </w:rPr>
-        <w:t>Sơ đồ dưới đây mô tả đường đi của một đơn hàng có áp mã, từ lúc khách xác nhận đặt hàng tới lúc ưu đãi được ghi nhận, kèm hai nhánh từ chối.</w:t>
+        <w:t>Sơ đồ dưới đây mô tả đường đi của một đơn hàng có áp mã, từ lúc khách xác nhận đặt hàng tới lúc ưu đãi được ghi nhận, kèm nhánh giá lệch bảng giá và nhánh mã vừa mất hiệu lực, trong đó khách nhận tổng mới để xác nhận lại.</w:t>
       </w:r>
     </w:p>
     <w:p>
@@ -1993,7 +1993,7 @@
                 <w:szCs w:val="26"/>
                 <w:rtl w:val="0"/>
               </w:rPr>
-              <w:t>Mã được chấm theo tám bước có thứ tự: mã ngừng hoạt động, chưa tới hạn, đã hết hạn, hết lượt toàn hệ thống, chiến dịch cha dừng hoặc ngoài khung ngày hoặc cạn ngân sách, sai nhóm khách, hết lượt của chính khách, chưa đạt giá trị đơn tối thiểu.</w:t>
+              <w:t>Mã được chấm theo chín bước có thứ tự: mã ngừng hoạt động, chưa tới hạn, đã hết hạn, hết lượt toàn hệ thống, chiến dịch cha dừng hoặc ngoài khung ngày hoặc cạn ngân sách, sai nhóm khách, sai danh mục, hết lượt của chính khách, chưa đạt giá trị đơn tối thiểu.</w:t>
             </w:r>
           </w:p>
         </w:tc>
@@ -2507,63 +2507,63 @@
                 <w:szCs w:val="26"/>
                 <w:rtl w:val="0"/>
               </w:rPr>
-              <w:t>AD_ORDER_01</w:t>
-            </w:r>
-          </w:p>
-        </w:tc>
-        <w:tc>
-          <w:tcPr>
-            <w:tcW w:type="dxa" w:w="2235"/>
-          </w:tcPr>
-          <w:p>
-            <w:pPr>
-              <w:shd w:fill="ffffff" w:val="clear"/>
-              <w:spacing w:before="200" w:line="360" w:lineRule="auto"/>
-              <w:jc w:val="both"/>
-              <w:rPr>
-                <w:rFonts w:ascii="Times New Roman" w:cs="Times New Roman" w:eastAsia="Times New Roman" w:hAnsi="Times New Roman"/>
-                <w:sz w:val="26"/>
-                <w:szCs w:val="26"/>
-              </w:rPr>
-            </w:pPr>
-            <w:r/>
-            <w:r>
-              <w:rPr>
-                <w:rFonts w:ascii="Times New Roman" w:cs="Times New Roman" w:eastAsia="Times New Roman" w:hAnsi="Times New Roman"/>
-                <w:b w:val="0"/>
-                <w:sz w:val="26"/>
-                <w:szCs w:val="26"/>
-                <w:rtl w:val="0"/>
-              </w:rPr>
-              <w:t>Máy chủ là nơi duy nhất chốt số tiền</w:t>
-            </w:r>
-          </w:p>
-        </w:tc>
-        <w:tc>
-          <w:tcPr>
-            <w:tcW w:type="dxa" w:w="2235"/>
-          </w:tcPr>
-          <w:p>
-            <w:pPr>
-              <w:shd w:fill="ffffff" w:val="clear"/>
-              <w:spacing w:before="200" w:line="360" w:lineRule="auto"/>
-              <w:jc w:val="both"/>
-              <w:rPr>
-                <w:rFonts w:ascii="Times New Roman" w:cs="Times New Roman" w:eastAsia="Times New Roman" w:hAnsi="Times New Roman"/>
-                <w:sz w:val="26"/>
-                <w:szCs w:val="26"/>
-              </w:rPr>
-            </w:pPr>
-            <w:r/>
-            <w:r>
-              <w:rPr>
-                <w:rFonts w:ascii="Times New Roman" w:cs="Times New Roman" w:eastAsia="Times New Roman" w:hAnsi="Times New Roman"/>
-                <w:b w:val="0"/>
-                <w:sz w:val="26"/>
-                <w:szCs w:val="26"/>
-                <w:rtl w:val="0"/>
-              </w:rPr>
-              <w:t>Đơn giá, tạm tính, phí vận chuyển, số tiền giảm và tổng thanh toán đều do máy chủ tính từ bảng giá và từ kết quả chấm mã.</w:t>
+              <w:t>AD_VOUCHER_07</w:t>
+            </w:r>
+          </w:p>
+        </w:tc>
+        <w:tc>
+          <w:tcPr>
+            <w:tcW w:type="dxa" w:w="2235"/>
+          </w:tcPr>
+          <w:p>
+            <w:pPr>
+              <w:shd w:fill="ffffff" w:val="clear"/>
+              <w:spacing w:before="200" w:line="360" w:lineRule="auto"/>
+              <w:jc w:val="both"/>
+              <w:rPr>
+                <w:rFonts w:ascii="Times New Roman" w:cs="Times New Roman" w:eastAsia="Times New Roman" w:hAnsi="Times New Roman"/>
+                <w:sz w:val="26"/>
+                <w:szCs w:val="26"/>
+              </w:rPr>
+            </w:pPr>
+            <w:r/>
+            <w:r>
+              <w:rPr>
+                <w:rFonts w:ascii="Times New Roman" w:cs="Times New Roman" w:eastAsia="Times New Roman" w:hAnsi="Times New Roman"/>
+                <w:b w:val="0"/>
+                <w:sz w:val="26"/>
+                <w:szCs w:val="26"/>
+                <w:rtl w:val="0"/>
+              </w:rPr>
+              <w:t>Mã theo danh mục chỉ tính trên phần hàng thuộc danh mục</w:t>
+            </w:r>
+          </w:p>
+        </w:tc>
+        <w:tc>
+          <w:tcPr>
+            <w:tcW w:type="dxa" w:w="2235"/>
+          </w:tcPr>
+          <w:p>
+            <w:pPr>
+              <w:shd w:fill="ffffff" w:val="clear"/>
+              <w:spacing w:before="200" w:line="360" w:lineRule="auto"/>
+              <w:jc w:val="both"/>
+              <w:rPr>
+                <w:rFonts w:ascii="Times New Roman" w:cs="Times New Roman" w:eastAsia="Times New Roman" w:hAnsi="Times New Roman"/>
+                <w:sz w:val="26"/>
+                <w:szCs w:val="26"/>
+              </w:rPr>
+            </w:pPr>
+            <w:r/>
+            <w:r>
+              <w:rPr>
+                <w:rFonts w:ascii="Times New Roman" w:cs="Times New Roman" w:eastAsia="Times New Roman" w:hAnsi="Times New Roman"/>
+                <w:b w:val="0"/>
+                <w:sz w:val="26"/>
+                <w:szCs w:val="26"/>
+                <w:rtl w:val="0"/>
+              </w:rPr>
+              <w:t>Mã có khai danh mục áp dụng thì giá trị đơn tối thiểu và số tiền giảm đều tính trên tổng các dòng hàng thuộc danh mục đó. Danh mục cha bao luôn danh mục con.</w:t>
             </w:r>
           </w:p>
         </w:tc>
@@ -2591,7 +2591,7 @@
                 <w:szCs w:val="26"/>
                 <w:rtl w:val="0"/>
               </w:rPr>
-              <w:t>Bỏ qua mọi số tiền do trình duyệt gửi lên. Đơn giá trình duyệt khai lệch bảng giá thì từ chối đơn và yêu cầu khách tải lại giỏ hàng.</w:t>
+              <w:t>Giỏ không có dòng hàng nào thuộc danh mục thì từ chối với lý do sai danh mục: mã chỉ áp cho danh mục nêu tên, giỏ hàng chưa có sản phẩm phù hợp. Khi quản trị viên lưu mã, mọi danh mục khai báo phải tồn tại.</w:t>
             </w:r>
           </w:p>
         </w:tc>
@@ -2621,63 +2621,63 @@
                 <w:szCs w:val="26"/>
                 <w:rtl w:val="0"/>
               </w:rPr>
-              <w:t>AD_ORDER_02</w:t>
-            </w:r>
-          </w:p>
-        </w:tc>
-        <w:tc>
-          <w:tcPr>
-            <w:tcW w:type="dxa" w:w="2235"/>
-          </w:tcPr>
-          <w:p>
-            <w:pPr>
-              <w:shd w:fill="ffffff" w:val="clear"/>
-              <w:spacing w:before="200" w:line="360" w:lineRule="auto"/>
-              <w:jc w:val="both"/>
-              <w:rPr>
-                <w:rFonts w:ascii="Times New Roman" w:cs="Times New Roman" w:eastAsia="Times New Roman" w:hAnsi="Times New Roman"/>
-                <w:sz w:val="26"/>
-                <w:szCs w:val="26"/>
-              </w:rPr>
-            </w:pPr>
-            <w:r/>
-            <w:r>
-              <w:rPr>
-                <w:rFonts w:ascii="Times New Roman" w:cs="Times New Roman" w:eastAsia="Times New Roman" w:hAnsi="Times New Roman"/>
-                <w:b w:val="0"/>
-                <w:sz w:val="26"/>
-                <w:szCs w:val="26"/>
-                <w:rtl w:val="0"/>
-              </w:rPr>
-              <w:t>Giảm giá không vượt giá trị đơn</w:t>
-            </w:r>
-          </w:p>
-        </w:tc>
-        <w:tc>
-          <w:tcPr>
-            <w:tcW w:type="dxa" w:w="2235"/>
-          </w:tcPr>
-          <w:p>
-            <w:pPr>
-              <w:shd w:fill="ffffff" w:val="clear"/>
-              <w:spacing w:before="200" w:line="360" w:lineRule="auto"/>
-              <w:jc w:val="both"/>
-              <w:rPr>
-                <w:rFonts w:ascii="Times New Roman" w:cs="Times New Roman" w:eastAsia="Times New Roman" w:hAnsi="Times New Roman"/>
-                <w:sz w:val="26"/>
-                <w:szCs w:val="26"/>
-              </w:rPr>
-            </w:pPr>
-            <w:r/>
-            <w:r>
-              <w:rPr>
-                <w:rFonts w:ascii="Times New Roman" w:cs="Times New Roman" w:eastAsia="Times New Roman" w:hAnsi="Times New Roman"/>
-                <w:b w:val="0"/>
-                <w:sz w:val="26"/>
-                <w:szCs w:val="26"/>
-                <w:rtl w:val="0"/>
-              </w:rPr>
-              <w:t>Số tiền giảm của một đơn không bao giờ lớn hơn giá trị hàng hoá của đơn đó.</w:t>
+              <w:t>AD_ORDER_01</w:t>
+            </w:r>
+          </w:p>
+        </w:tc>
+        <w:tc>
+          <w:tcPr>
+            <w:tcW w:type="dxa" w:w="2235"/>
+          </w:tcPr>
+          <w:p>
+            <w:pPr>
+              <w:shd w:fill="ffffff" w:val="clear"/>
+              <w:spacing w:before="200" w:line="360" w:lineRule="auto"/>
+              <w:jc w:val="both"/>
+              <w:rPr>
+                <w:rFonts w:ascii="Times New Roman" w:cs="Times New Roman" w:eastAsia="Times New Roman" w:hAnsi="Times New Roman"/>
+                <w:sz w:val="26"/>
+                <w:szCs w:val="26"/>
+              </w:rPr>
+            </w:pPr>
+            <w:r/>
+            <w:r>
+              <w:rPr>
+                <w:rFonts w:ascii="Times New Roman" w:cs="Times New Roman" w:eastAsia="Times New Roman" w:hAnsi="Times New Roman"/>
+                <w:b w:val="0"/>
+                <w:sz w:val="26"/>
+                <w:szCs w:val="26"/>
+                <w:rtl w:val="0"/>
+              </w:rPr>
+              <w:t>Máy chủ là nơi duy nhất chốt số tiền</w:t>
+            </w:r>
+          </w:p>
+        </w:tc>
+        <w:tc>
+          <w:tcPr>
+            <w:tcW w:type="dxa" w:w="2235"/>
+          </w:tcPr>
+          <w:p>
+            <w:pPr>
+              <w:shd w:fill="ffffff" w:val="clear"/>
+              <w:spacing w:before="200" w:line="360" w:lineRule="auto"/>
+              <w:jc w:val="both"/>
+              <w:rPr>
+                <w:rFonts w:ascii="Times New Roman" w:cs="Times New Roman" w:eastAsia="Times New Roman" w:hAnsi="Times New Roman"/>
+                <w:sz w:val="26"/>
+                <w:szCs w:val="26"/>
+              </w:rPr>
+            </w:pPr>
+            <w:r/>
+            <w:r>
+              <w:rPr>
+                <w:rFonts w:ascii="Times New Roman" w:cs="Times New Roman" w:eastAsia="Times New Roman" w:hAnsi="Times New Roman"/>
+                <w:b w:val="0"/>
+                <w:sz w:val="26"/>
+                <w:szCs w:val="26"/>
+                <w:rtl w:val="0"/>
+              </w:rPr>
+              <w:t>Đơn giá, tạm tính, phí vận chuyển, số tiền giảm và tổng thanh toán đều do máy chủ tính từ bảng giá và từ kết quả chấm mã.</w:t>
             </w:r>
           </w:p>
         </w:tc>
@@ -2705,7 +2705,7 @@
                 <w:szCs w:val="26"/>
                 <w:rtl w:val="0"/>
               </w:rPr>
-              <w:t>Cắt phần vượt trước khi tính tổng thanh toán, để tổng tiền không bao giờ âm.</w:t>
+              <w:t>Bỏ qua mọi số tiền do trình duyệt gửi lên. Đơn giá trình duyệt khai lệch bảng giá thì từ chối đơn và yêu cầu khách tải lại giỏ hàng.</w:t>
             </w:r>
           </w:p>
         </w:tc>
@@ -2735,63 +2735,63 @@
                 <w:szCs w:val="26"/>
                 <w:rtl w:val="0"/>
               </w:rPr>
-              <w:t>AD_ORDER_03</w:t>
-            </w:r>
-          </w:p>
-        </w:tc>
-        <w:tc>
-          <w:tcPr>
-            <w:tcW w:type="dxa" w:w="2235"/>
-          </w:tcPr>
-          <w:p>
-            <w:pPr>
-              <w:shd w:fill="ffffff" w:val="clear"/>
-              <w:spacing w:before="200" w:line="360" w:lineRule="auto"/>
-              <w:jc w:val="both"/>
-              <w:rPr>
-                <w:rFonts w:ascii="Times New Roman" w:cs="Times New Roman" w:eastAsia="Times New Roman" w:hAnsi="Times New Roman"/>
-                <w:sz w:val="26"/>
-                <w:szCs w:val="26"/>
-              </w:rPr>
-            </w:pPr>
-            <w:r/>
-            <w:r>
-              <w:rPr>
-                <w:rFonts w:ascii="Times New Roman" w:cs="Times New Roman" w:eastAsia="Times New Roman" w:hAnsi="Times New Roman"/>
-                <w:b w:val="0"/>
-                <w:sz w:val="26"/>
-                <w:szCs w:val="26"/>
-                <w:rtl w:val="0"/>
-              </w:rPr>
-              <w:t>Miễn phí vận chuyển là ngưỡng, không phải mã</w:t>
-            </w:r>
-          </w:p>
-        </w:tc>
-        <w:tc>
-          <w:tcPr>
-            <w:tcW w:type="dxa" w:w="2235"/>
-          </w:tcPr>
-          <w:p>
-            <w:pPr>
-              <w:shd w:fill="ffffff" w:val="clear"/>
-              <w:spacing w:before="200" w:line="360" w:lineRule="auto"/>
-              <w:jc w:val="both"/>
-              <w:rPr>
-                <w:rFonts w:ascii="Times New Roman" w:cs="Times New Roman" w:eastAsia="Times New Roman" w:hAnsi="Times New Roman"/>
-                <w:sz w:val="26"/>
-                <w:szCs w:val="26"/>
-              </w:rPr>
-            </w:pPr>
-            <w:r/>
-            <w:r>
-              <w:rPr>
-                <w:rFonts w:ascii="Times New Roman" w:cs="Times New Roman" w:eastAsia="Times New Roman" w:hAnsi="Times New Roman"/>
-                <w:b w:val="0"/>
-                <w:sz w:val="26"/>
-                <w:szCs w:val="26"/>
-                <w:rtl w:val="0"/>
-              </w:rPr>
-              <w:t>Miễn phí vận chuyển được xác định theo ngưỡng giá trị đơn do máy chủ giữ, áp độc lập với mã giảm giá.</w:t>
+              <w:t>AD_ORDER_02</w:t>
+            </w:r>
+          </w:p>
+        </w:tc>
+        <w:tc>
+          <w:tcPr>
+            <w:tcW w:type="dxa" w:w="2235"/>
+          </w:tcPr>
+          <w:p>
+            <w:pPr>
+              <w:shd w:fill="ffffff" w:val="clear"/>
+              <w:spacing w:before="200" w:line="360" w:lineRule="auto"/>
+              <w:jc w:val="both"/>
+              <w:rPr>
+                <w:rFonts w:ascii="Times New Roman" w:cs="Times New Roman" w:eastAsia="Times New Roman" w:hAnsi="Times New Roman"/>
+                <w:sz w:val="26"/>
+                <w:szCs w:val="26"/>
+              </w:rPr>
+            </w:pPr>
+            <w:r/>
+            <w:r>
+              <w:rPr>
+                <w:rFonts w:ascii="Times New Roman" w:cs="Times New Roman" w:eastAsia="Times New Roman" w:hAnsi="Times New Roman"/>
+                <w:b w:val="0"/>
+                <w:sz w:val="26"/>
+                <w:szCs w:val="26"/>
+                <w:rtl w:val="0"/>
+              </w:rPr>
+              <w:t>Giảm giá không vượt giá trị đơn</w:t>
+            </w:r>
+          </w:p>
+        </w:tc>
+        <w:tc>
+          <w:tcPr>
+            <w:tcW w:type="dxa" w:w="2235"/>
+          </w:tcPr>
+          <w:p>
+            <w:pPr>
+              <w:shd w:fill="ffffff" w:val="clear"/>
+              <w:spacing w:before="200" w:line="360" w:lineRule="auto"/>
+              <w:jc w:val="both"/>
+              <w:rPr>
+                <w:rFonts w:ascii="Times New Roman" w:cs="Times New Roman" w:eastAsia="Times New Roman" w:hAnsi="Times New Roman"/>
+                <w:sz w:val="26"/>
+                <w:szCs w:val="26"/>
+              </w:rPr>
+            </w:pPr>
+            <w:r/>
+            <w:r>
+              <w:rPr>
+                <w:rFonts w:ascii="Times New Roman" w:cs="Times New Roman" w:eastAsia="Times New Roman" w:hAnsi="Times New Roman"/>
+                <w:b w:val="0"/>
+                <w:sz w:val="26"/>
+                <w:szCs w:val="26"/>
+                <w:rtl w:val="0"/>
+              </w:rPr>
+              <w:t>Số tiền giảm của một đơn không bao giờ lớn hơn giá trị hàng hoá của đơn đó.</w:t>
             </w:r>
           </w:p>
         </w:tc>
@@ -2819,7 +2819,7 @@
                 <w:szCs w:val="26"/>
                 <w:rtl w:val="0"/>
               </w:rPr>
-              <w:t>Tính phí theo ngưỡng cấu hình ở máy chủ và hiển thị số tiền còn thiếu để đạt ngưỡng. Khách vẫn dùng được một mã giảm giá cùng lúc.</w:t>
+              <w:t>Cắt phần vượt trước khi tính tổng thanh toán, để tổng tiền không bao giờ âm.</w:t>
             </w:r>
           </w:p>
         </w:tc>
@@ -2849,63 +2849,63 @@
                 <w:szCs w:val="26"/>
                 <w:rtl w:val="0"/>
               </w:rPr>
-              <w:t>AD_ORDER_04</w:t>
-            </w:r>
-          </w:p>
-        </w:tc>
-        <w:tc>
-          <w:tcPr>
-            <w:tcW w:type="dxa" w:w="2235"/>
-          </w:tcPr>
-          <w:p>
-            <w:pPr>
-              <w:shd w:fill="ffffff" w:val="clear"/>
-              <w:spacing w:before="200" w:line="360" w:lineRule="auto"/>
-              <w:jc w:val="both"/>
-              <w:rPr>
-                <w:rFonts w:ascii="Times New Roman" w:cs="Times New Roman" w:eastAsia="Times New Roman" w:hAnsi="Times New Roman"/>
-                <w:sz w:val="26"/>
-                <w:szCs w:val="26"/>
-              </w:rPr>
-            </w:pPr>
-            <w:r/>
-            <w:r>
-              <w:rPr>
-                <w:rFonts w:ascii="Times New Roman" w:cs="Times New Roman" w:eastAsia="Times New Roman" w:hAnsi="Times New Roman"/>
-                <w:b w:val="0"/>
-                <w:sz w:val="26"/>
-                <w:szCs w:val="26"/>
-                <w:rtl w:val="0"/>
-              </w:rPr>
-              <w:t>Ghi lượt dùng và ngân sách trong cùng giao dịch</w:t>
-            </w:r>
-          </w:p>
-        </w:tc>
-        <w:tc>
-          <w:tcPr>
-            <w:tcW w:type="dxa" w:w="2235"/>
-          </w:tcPr>
-          <w:p>
-            <w:pPr>
-              <w:shd w:fill="ffffff" w:val="clear"/>
-              <w:spacing w:before="200" w:line="360" w:lineRule="auto"/>
-              <w:jc w:val="both"/>
-              <w:rPr>
-                <w:rFonts w:ascii="Times New Roman" w:cs="Times New Roman" w:eastAsia="Times New Roman" w:hAnsi="Times New Roman"/>
-                <w:sz w:val="26"/>
-                <w:szCs w:val="26"/>
-              </w:rPr>
-            </w:pPr>
-            <w:r/>
-            <w:r>
-              <w:rPr>
-                <w:rFonts w:ascii="Times New Roman" w:cs="Times New Roman" w:eastAsia="Times New Roman" w:hAnsi="Times New Roman"/>
-                <w:b w:val="0"/>
-                <w:sz w:val="26"/>
-                <w:szCs w:val="26"/>
-                <w:rtl w:val="0"/>
-              </w:rPr>
-              <w:t>Việc tăng số lượt đã dùng của mã và cộng dồn ngân sách chiến dịch phải xảy ra trọn vẹn hoặc không xảy ra.</w:t>
+              <w:t>AD_ORDER_03</w:t>
+            </w:r>
+          </w:p>
+        </w:tc>
+        <w:tc>
+          <w:tcPr>
+            <w:tcW w:type="dxa" w:w="2235"/>
+          </w:tcPr>
+          <w:p>
+            <w:pPr>
+              <w:shd w:fill="ffffff" w:val="clear"/>
+              <w:spacing w:before="200" w:line="360" w:lineRule="auto"/>
+              <w:jc w:val="both"/>
+              <w:rPr>
+                <w:rFonts w:ascii="Times New Roman" w:cs="Times New Roman" w:eastAsia="Times New Roman" w:hAnsi="Times New Roman"/>
+                <w:sz w:val="26"/>
+                <w:szCs w:val="26"/>
+              </w:rPr>
+            </w:pPr>
+            <w:r/>
+            <w:r>
+              <w:rPr>
+                <w:rFonts w:ascii="Times New Roman" w:cs="Times New Roman" w:eastAsia="Times New Roman" w:hAnsi="Times New Roman"/>
+                <w:b w:val="0"/>
+                <w:sz w:val="26"/>
+                <w:szCs w:val="26"/>
+                <w:rtl w:val="0"/>
+              </w:rPr>
+              <w:t>Miễn phí vận chuyển là ngưỡng, không phải mã</w:t>
+            </w:r>
+          </w:p>
+        </w:tc>
+        <w:tc>
+          <w:tcPr>
+            <w:tcW w:type="dxa" w:w="2235"/>
+          </w:tcPr>
+          <w:p>
+            <w:pPr>
+              <w:shd w:fill="ffffff" w:val="clear"/>
+              <w:spacing w:before="200" w:line="360" w:lineRule="auto"/>
+              <w:jc w:val="both"/>
+              <w:rPr>
+                <w:rFonts w:ascii="Times New Roman" w:cs="Times New Roman" w:eastAsia="Times New Roman" w:hAnsi="Times New Roman"/>
+                <w:sz w:val="26"/>
+                <w:szCs w:val="26"/>
+              </w:rPr>
+            </w:pPr>
+            <w:r/>
+            <w:r>
+              <w:rPr>
+                <w:rFonts w:ascii="Times New Roman" w:cs="Times New Roman" w:eastAsia="Times New Roman" w:hAnsi="Times New Roman"/>
+                <w:b w:val="0"/>
+                <w:sz w:val="26"/>
+                <w:szCs w:val="26"/>
+                <w:rtl w:val="0"/>
+              </w:rPr>
+              <w:t>Miễn phí vận chuyển được xác định theo ngưỡng giá trị đơn do máy chủ giữ, áp độc lập với mã giảm giá.</w:t>
             </w:r>
           </w:p>
         </w:tc>
@@ -2933,7 +2933,7 @@
                 <w:szCs w:val="26"/>
                 <w:rtl w:val="0"/>
               </w:rPr>
-              <w:t>Khoá dòng mã khi ghi, nên hai đơn đặt cùng lúc không ghi đè số lượt của nhau. Huỷ đơn thì hoàn lại cả lượt dùng lẫn phần ngân sách đã cộng.</w:t>
+              <w:t>Tính phí theo ngưỡng cấu hình ở máy chủ và hiển thị số tiền còn thiếu để đạt ngưỡng. Khách vẫn dùng được một mã giảm giá cùng lúc.</w:t>
             </w:r>
           </w:p>
         </w:tc>
@@ -2963,63 +2963,63 @@
                 <w:szCs w:val="26"/>
                 <w:rtl w:val="0"/>
               </w:rPr>
-              <w:t>AD_OFFER_01</w:t>
-            </w:r>
-          </w:p>
-        </w:tc>
-        <w:tc>
-          <w:tcPr>
-            <w:tcW w:type="dxa" w:w="2235"/>
-          </w:tcPr>
-          <w:p>
-            <w:pPr>
-              <w:shd w:fill="ffffff" w:val="clear"/>
-              <w:spacing w:before="200" w:line="360" w:lineRule="auto"/>
-              <w:jc w:val="both"/>
-              <w:rPr>
-                <w:rFonts w:ascii="Times New Roman" w:cs="Times New Roman" w:eastAsia="Times New Roman" w:hAnsi="Times New Roman"/>
-                <w:sz w:val="26"/>
-                <w:szCs w:val="26"/>
-              </w:rPr>
-            </w:pPr>
-            <w:r/>
-            <w:r>
-              <w:rPr>
-                <w:rFonts w:ascii="Times New Roman" w:cs="Times New Roman" w:eastAsia="Times New Roman" w:hAnsi="Times New Roman"/>
-                <w:b w:val="0"/>
-                <w:sz w:val="26"/>
-                <w:szCs w:val="26"/>
-                <w:rtl w:val="0"/>
-              </w:rPr>
-              <w:t>Trang Ưu đãi phản ánh đúng chiến dịch đang chạy</w:t>
-            </w:r>
-          </w:p>
-        </w:tc>
-        <w:tc>
-          <w:tcPr>
-            <w:tcW w:type="dxa" w:w="2235"/>
-          </w:tcPr>
-          <w:p>
-            <w:pPr>
-              <w:shd w:fill="ffffff" w:val="clear"/>
-              <w:spacing w:before="200" w:line="360" w:lineRule="auto"/>
-              <w:jc w:val="both"/>
-              <w:rPr>
-                <w:rFonts w:ascii="Times New Roman" w:cs="Times New Roman" w:eastAsia="Times New Roman" w:hAnsi="Times New Roman"/>
-                <w:sz w:val="26"/>
-                <w:szCs w:val="26"/>
-              </w:rPr>
-            </w:pPr>
-            <w:r/>
-            <w:r>
-              <w:rPr>
-                <w:rFonts w:ascii="Times New Roman" w:cs="Times New Roman" w:eastAsia="Times New Roman" w:hAnsi="Times New Roman"/>
-                <w:b w:val="0"/>
-                <w:sz w:val="26"/>
-                <w:szCs w:val="26"/>
-                <w:rtl w:val="0"/>
-              </w:rPr>
-              <w:t>Trang Ưu đãi hiển thị các chiến dịch đang trong khung thời gian và đang bật, nhóm theo ưu đãi dành riêng cho khách, ưu đãi đang diễn ra và ưu đãi sắp hết hạn.</w:t>
+              <w:t>AD_ORDER_04</w:t>
+            </w:r>
+          </w:p>
+        </w:tc>
+        <w:tc>
+          <w:tcPr>
+            <w:tcW w:type="dxa" w:w="2235"/>
+          </w:tcPr>
+          <w:p>
+            <w:pPr>
+              <w:shd w:fill="ffffff" w:val="clear"/>
+              <w:spacing w:before="200" w:line="360" w:lineRule="auto"/>
+              <w:jc w:val="both"/>
+              <w:rPr>
+                <w:rFonts w:ascii="Times New Roman" w:cs="Times New Roman" w:eastAsia="Times New Roman" w:hAnsi="Times New Roman"/>
+                <w:sz w:val="26"/>
+                <w:szCs w:val="26"/>
+              </w:rPr>
+            </w:pPr>
+            <w:r/>
+            <w:r>
+              <w:rPr>
+                <w:rFonts w:ascii="Times New Roman" w:cs="Times New Roman" w:eastAsia="Times New Roman" w:hAnsi="Times New Roman"/>
+                <w:b w:val="0"/>
+                <w:sz w:val="26"/>
+                <w:szCs w:val="26"/>
+                <w:rtl w:val="0"/>
+              </w:rPr>
+              <w:t>Ghi lượt dùng và ngân sách trong cùng giao dịch</w:t>
+            </w:r>
+          </w:p>
+        </w:tc>
+        <w:tc>
+          <w:tcPr>
+            <w:tcW w:type="dxa" w:w="2235"/>
+          </w:tcPr>
+          <w:p>
+            <w:pPr>
+              <w:shd w:fill="ffffff" w:val="clear"/>
+              <w:spacing w:before="200" w:line="360" w:lineRule="auto"/>
+              <w:jc w:val="both"/>
+              <w:rPr>
+                <w:rFonts w:ascii="Times New Roman" w:cs="Times New Roman" w:eastAsia="Times New Roman" w:hAnsi="Times New Roman"/>
+                <w:sz w:val="26"/>
+                <w:szCs w:val="26"/>
+              </w:rPr>
+            </w:pPr>
+            <w:r/>
+            <w:r>
+              <w:rPr>
+                <w:rFonts w:ascii="Times New Roman" w:cs="Times New Roman" w:eastAsia="Times New Roman" w:hAnsi="Times New Roman"/>
+                <w:b w:val="0"/>
+                <w:sz w:val="26"/>
+                <w:szCs w:val="26"/>
+                <w:rtl w:val="0"/>
+              </w:rPr>
+              <w:t>Việc tăng số lượt đã dùng của mã và cộng dồn ngân sách chiến dịch phải xảy ra trọn vẹn hoặc không xảy ra.</w:t>
             </w:r>
           </w:p>
         </w:tc>
@@ -3047,7 +3047,7 @@
                 <w:szCs w:val="26"/>
                 <w:rtl w:val="0"/>
               </w:rPr>
-              <w:t>Đọc trực tiếp từ dữ liệu chiến dịch, không dùng nội dung viết cứng trong mã nguồn. Chiến dịch bị tạm dừng hoặc đã kết thúc thì biến mất khỏi trang khách ở lần tải kế tiếp.</w:t>
+              <w:t>Khoá dòng mã khi ghi, nên hai đơn đặt cùng lúc không ghi đè số lượt của nhau.</w:t>
             </w:r>
           </w:p>
         </w:tc>
@@ -3077,63 +3077,63 @@
                 <w:szCs w:val="26"/>
                 <w:rtl w:val="0"/>
               </w:rPr>
-              <w:t>AD_COMBO_01</w:t>
-            </w:r>
-          </w:p>
-        </w:tc>
-        <w:tc>
-          <w:tcPr>
-            <w:tcW w:type="dxa" w:w="2235"/>
-          </w:tcPr>
-          <w:p>
-            <w:pPr>
-              <w:shd w:fill="ffffff" w:val="clear"/>
-              <w:spacing w:before="200" w:line="360" w:lineRule="auto"/>
-              <w:jc w:val="both"/>
-              <w:rPr>
-                <w:rFonts w:ascii="Times New Roman" w:cs="Times New Roman" w:eastAsia="Times New Roman" w:hAnsi="Times New Roman"/>
-                <w:sz w:val="26"/>
-                <w:szCs w:val="26"/>
-              </w:rPr>
-            </w:pPr>
-            <w:r/>
-            <w:r>
-              <w:rPr>
-                <w:rFonts w:ascii="Times New Roman" w:cs="Times New Roman" w:eastAsia="Times New Roman" w:hAnsi="Times New Roman"/>
-                <w:b w:val="0"/>
-                <w:sz w:val="26"/>
-                <w:szCs w:val="26"/>
-                <w:rtl w:val="0"/>
-              </w:rPr>
-              <w:t>Giá combo thấp hơn tổng giá lẻ</w:t>
-            </w:r>
-          </w:p>
-        </w:tc>
-        <w:tc>
-          <w:tcPr>
-            <w:tcW w:type="dxa" w:w="2235"/>
-          </w:tcPr>
-          <w:p>
-            <w:pPr>
-              <w:shd w:fill="ffffff" w:val="clear"/>
-              <w:spacing w:before="200" w:line="360" w:lineRule="auto"/>
-              <w:jc w:val="both"/>
-              <w:rPr>
-                <w:rFonts w:ascii="Times New Roman" w:cs="Times New Roman" w:eastAsia="Times New Roman" w:hAnsi="Times New Roman"/>
-                <w:sz w:val="26"/>
-                <w:szCs w:val="26"/>
-              </w:rPr>
-            </w:pPr>
-            <w:r/>
-            <w:r>
-              <w:rPr>
-                <w:rFonts w:ascii="Times New Roman" w:cs="Times New Roman" w:eastAsia="Times New Roman" w:hAnsi="Times New Roman"/>
-                <w:b w:val="0"/>
-                <w:sz w:val="26"/>
-                <w:szCs w:val="26"/>
-                <w:rtl w:val="0"/>
-              </w:rPr>
-              <w:t>Giá của một combo phải thấp hơn tổng giá bán hiện hành của các sản phẩm thành phần.</w:t>
+              <w:t>AD_ORDER_05</w:t>
+            </w:r>
+          </w:p>
+        </w:tc>
+        <w:tc>
+          <w:tcPr>
+            <w:tcW w:type="dxa" w:w="2235"/>
+          </w:tcPr>
+          <w:p>
+            <w:pPr>
+              <w:shd w:fill="ffffff" w:val="clear"/>
+              <w:spacing w:before="200" w:line="360" w:lineRule="auto"/>
+              <w:jc w:val="both"/>
+              <w:rPr>
+                <w:rFonts w:ascii="Times New Roman" w:cs="Times New Roman" w:eastAsia="Times New Roman" w:hAnsi="Times New Roman"/>
+                <w:sz w:val="26"/>
+                <w:szCs w:val="26"/>
+              </w:rPr>
+            </w:pPr>
+            <w:r/>
+            <w:r>
+              <w:rPr>
+                <w:rFonts w:ascii="Times New Roman" w:cs="Times New Roman" w:eastAsia="Times New Roman" w:hAnsi="Times New Roman"/>
+                <w:b w:val="0"/>
+                <w:sz w:val="26"/>
+                <w:szCs w:val="26"/>
+                <w:rtl w:val="0"/>
+              </w:rPr>
+              <w:t>Mã mất hiệu lực lúc đặt đơn thì báo tổng mới</w:t>
+            </w:r>
+          </w:p>
+        </w:tc>
+        <w:tc>
+          <w:tcPr>
+            <w:tcW w:type="dxa" w:w="2235"/>
+          </w:tcPr>
+          <w:p>
+            <w:pPr>
+              <w:shd w:fill="ffffff" w:val="clear"/>
+              <w:spacing w:before="200" w:line="360" w:lineRule="auto"/>
+              <w:jc w:val="both"/>
+              <w:rPr>
+                <w:rFonts w:ascii="Times New Roman" w:cs="Times New Roman" w:eastAsia="Times New Roman" w:hAnsi="Times New Roman"/>
+                <w:sz w:val="26"/>
+                <w:szCs w:val="26"/>
+              </w:rPr>
+            </w:pPr>
+            <w:r/>
+            <w:r>
+              <w:rPr>
+                <w:rFonts w:ascii="Times New Roman" w:cs="Times New Roman" w:eastAsia="Times New Roman" w:hAnsi="Times New Roman"/>
+                <w:b w:val="0"/>
+                <w:sz w:val="26"/>
+                <w:szCs w:val="26"/>
+                <w:rtl w:val="0"/>
+              </w:rPr>
+              <w:t>Mã khách đã chọn có thể hết lượt hoặc hết hạn trong khoảng giữa lúc xem giỏ và lúc bấm đặt hàng.</w:t>
             </w:r>
           </w:p>
         </w:tc>
@@ -3161,7 +3161,7 @@
                 <w:szCs w:val="26"/>
                 <w:rtl w:val="0"/>
               </w:rPr>
-              <w:t>Tự động tính tổng giá lẻ khi tạo combo và cảnh báo nếu mức chênh không đạt tối thiểu 5%.</w:t>
+              <w:t>Không tạo đơn. Chọn mã thay thế cho số tiền giảm lớn nhất, hoặc không mã nếu không còn mã nào dùng được, tính lại tổng và báo khách. Đơn chỉ được tạo khi khách xác nhận tổng mới.</w:t>
             </w:r>
           </w:p>
         </w:tc>
@@ -3191,63 +3191,63 @@
                 <w:szCs w:val="26"/>
                 <w:rtl w:val="0"/>
               </w:rPr>
-              <w:t>AD_COMBO_02</w:t>
-            </w:r>
-          </w:p>
-        </w:tc>
-        <w:tc>
-          <w:tcPr>
-            <w:tcW w:type="dxa" w:w="2235"/>
-          </w:tcPr>
-          <w:p>
-            <w:pPr>
-              <w:shd w:fill="ffffff" w:val="clear"/>
-              <w:spacing w:before="200" w:line="360" w:lineRule="auto"/>
-              <w:jc w:val="both"/>
-              <w:rPr>
-                <w:rFonts w:ascii="Times New Roman" w:cs="Times New Roman" w:eastAsia="Times New Roman" w:hAnsi="Times New Roman"/>
-                <w:sz w:val="26"/>
-                <w:szCs w:val="26"/>
-              </w:rPr>
-            </w:pPr>
-            <w:r/>
-            <w:r>
-              <w:rPr>
-                <w:rFonts w:ascii="Times New Roman" w:cs="Times New Roman" w:eastAsia="Times New Roman" w:hAnsi="Times New Roman"/>
-                <w:b w:val="0"/>
-                <w:sz w:val="26"/>
-                <w:szCs w:val="26"/>
-                <w:rtl w:val="0"/>
-              </w:rPr>
-              <w:t>Combo phân rã thành dòng hàng theo biến thể</w:t>
-            </w:r>
-          </w:p>
-        </w:tc>
-        <w:tc>
-          <w:tcPr>
-            <w:tcW w:type="dxa" w:w="2235"/>
-          </w:tcPr>
-          <w:p>
-            <w:pPr>
-              <w:shd w:fill="ffffff" w:val="clear"/>
-              <w:spacing w:before="200" w:line="360" w:lineRule="auto"/>
-              <w:jc w:val="both"/>
-              <w:rPr>
-                <w:rFonts w:ascii="Times New Roman" w:cs="Times New Roman" w:eastAsia="Times New Roman" w:hAnsi="Times New Roman"/>
-                <w:sz w:val="26"/>
-                <w:szCs w:val="26"/>
-              </w:rPr>
-            </w:pPr>
-            <w:r/>
-            <w:r>
-              <w:rPr>
-                <w:rFonts w:ascii="Times New Roman" w:cs="Times New Roman" w:eastAsia="Times New Roman" w:hAnsi="Times New Roman"/>
-                <w:b w:val="0"/>
-                <w:sz w:val="26"/>
-                <w:szCs w:val="26"/>
-                <w:rtl w:val="0"/>
-              </w:rPr>
-              <w:t>Combo không phải một mặt hàng riêng. Khi vào giỏ, combo được tách thành các dòng hàng, mỗi dòng mang mã biến thể thật và đơn giá catalog của sản phẩm thành phần.</w:t>
+              <w:t>AD_ORDER_06</w:t>
+            </w:r>
+          </w:p>
+        </w:tc>
+        <w:tc>
+          <w:tcPr>
+            <w:tcW w:type="dxa" w:w="2235"/>
+          </w:tcPr>
+          <w:p>
+            <w:pPr>
+              <w:shd w:fill="ffffff" w:val="clear"/>
+              <w:spacing w:before="200" w:line="360" w:lineRule="auto"/>
+              <w:jc w:val="both"/>
+              <w:rPr>
+                <w:rFonts w:ascii="Times New Roman" w:cs="Times New Roman" w:eastAsia="Times New Roman" w:hAnsi="Times New Roman"/>
+                <w:sz w:val="26"/>
+                <w:szCs w:val="26"/>
+              </w:rPr>
+            </w:pPr>
+            <w:r/>
+            <w:r>
+              <w:rPr>
+                <w:rFonts w:ascii="Times New Roman" w:cs="Times New Roman" w:eastAsia="Times New Roman" w:hAnsi="Times New Roman"/>
+                <w:b w:val="0"/>
+                <w:sz w:val="26"/>
+                <w:szCs w:val="26"/>
+                <w:rtl w:val="0"/>
+              </w:rPr>
+              <w:t>Trả lượt mã đúng một lần</w:t>
+            </w:r>
+          </w:p>
+        </w:tc>
+        <w:tc>
+          <w:tcPr>
+            <w:tcW w:type="dxa" w:w="2235"/>
+          </w:tcPr>
+          <w:p>
+            <w:pPr>
+              <w:shd w:fill="ffffff" w:val="clear"/>
+              <w:spacing w:before="200" w:line="360" w:lineRule="auto"/>
+              <w:jc w:val="both"/>
+              <w:rPr>
+                <w:rFonts w:ascii="Times New Roman" w:cs="Times New Roman" w:eastAsia="Times New Roman" w:hAnsi="Times New Roman"/>
+                <w:sz w:val="26"/>
+                <w:szCs w:val="26"/>
+              </w:rPr>
+            </w:pPr>
+            <w:r/>
+            <w:r>
+              <w:rPr>
+                <w:rFonts w:ascii="Times New Roman" w:cs="Times New Roman" w:eastAsia="Times New Roman" w:hAnsi="Times New Roman"/>
+                <w:b w:val="0"/>
+                <w:sz w:val="26"/>
+                <w:szCs w:val="26"/>
+                <w:rtl w:val="0"/>
+              </w:rPr>
+              <w:t>Đơn không thành thì lượt dùng mã và phần ngân sách chiến dịch được trả lại. Đơn không thành gồm khách huỷ, quản trị viên huỷ, phiên thanh toán trực tuyến hết hạn hoặc bị huỷ.</w:t>
             </w:r>
           </w:p>
         </w:tc>
@@ -3275,7 +3275,7 @@
                 <w:szCs w:val="26"/>
                 <w:rtl w:val="0"/>
               </w:rPr>
-              <w:t>Áp cùng một quy tắc tính tiền như đơn thường, không cần ngoại lệ cho combo. Tồn kho trừ đúng tới từng biến thể sau khi đơn được xác nhận.</w:t>
+              <w:t>Đánh dấu thời điểm trả lượt trên đơn. Đơn đã được trả thì mọi lần gọi sau đều bỏ qua, kể cả khi cổng thanh toán gửi lại cùng một thông báo. Thẻ bị từ chối chưa tính là đơn không thành vì khách vẫn thử lại được trên cùng phiên thanh toán.</w:t>
             </w:r>
           </w:p>
         </w:tc>
@@ -3305,63 +3305,63 @@
                 <w:szCs w:val="26"/>
                 <w:rtl w:val="0"/>
               </w:rPr>
-              <w:t>AD_STATS_01</w:t>
-            </w:r>
-          </w:p>
-        </w:tc>
-        <w:tc>
-          <w:tcPr>
-            <w:tcW w:type="dxa" w:w="2235"/>
-          </w:tcPr>
-          <w:p>
-            <w:pPr>
-              <w:shd w:fill="ffffff" w:val="clear"/>
-              <w:spacing w:before="200" w:line="360" w:lineRule="auto"/>
-              <w:jc w:val="both"/>
-              <w:rPr>
-                <w:rFonts w:ascii="Times New Roman" w:cs="Times New Roman" w:eastAsia="Times New Roman" w:hAnsi="Times New Roman"/>
-                <w:sz w:val="26"/>
-                <w:szCs w:val="26"/>
-              </w:rPr>
-            </w:pPr>
-            <w:r/>
-            <w:r>
-              <w:rPr>
-                <w:rFonts w:ascii="Times New Roman" w:cs="Times New Roman" w:eastAsia="Times New Roman" w:hAnsi="Times New Roman"/>
-                <w:b w:val="0"/>
-                <w:sz w:val="26"/>
-                <w:szCs w:val="26"/>
-                <w:rtl w:val="0"/>
-              </w:rPr>
-              <w:t>Thống kê đọc từ đơn hàng thật</w:t>
-            </w:r>
-          </w:p>
-        </w:tc>
-        <w:tc>
-          <w:tcPr>
-            <w:tcW w:type="dxa" w:w="2235"/>
-          </w:tcPr>
-          <w:p>
-            <w:pPr>
-              <w:shd w:fill="ffffff" w:val="clear"/>
-              <w:spacing w:before="200" w:line="360" w:lineRule="auto"/>
-              <w:jc w:val="both"/>
-              <w:rPr>
-                <w:rFonts w:ascii="Times New Roman" w:cs="Times New Roman" w:eastAsia="Times New Roman" w:hAnsi="Times New Roman"/>
-                <w:sz w:val="26"/>
-                <w:szCs w:val="26"/>
-              </w:rPr>
-            </w:pPr>
-            <w:r/>
-            <w:r>
-              <w:rPr>
-                <w:rFonts w:ascii="Times New Roman" w:cs="Times New Roman" w:eastAsia="Times New Roman" w:hAnsi="Times New Roman"/>
-                <w:b w:val="0"/>
-                <w:sz w:val="26"/>
-                <w:szCs w:val="26"/>
-                <w:rtl w:val="0"/>
-              </w:rPr>
-              <w:t>Các chỉ số hiệu quả khuyến mãi được tính từ bảng đơn hàng, không phải từ số dòng trong bảng chiến dịch hay bảng mã.</w:t>
+              <w:t>AD_OFFER_01</w:t>
+            </w:r>
+          </w:p>
+        </w:tc>
+        <w:tc>
+          <w:tcPr>
+            <w:tcW w:type="dxa" w:w="2235"/>
+          </w:tcPr>
+          <w:p>
+            <w:pPr>
+              <w:shd w:fill="ffffff" w:val="clear"/>
+              <w:spacing w:before="200" w:line="360" w:lineRule="auto"/>
+              <w:jc w:val="both"/>
+              <w:rPr>
+                <w:rFonts w:ascii="Times New Roman" w:cs="Times New Roman" w:eastAsia="Times New Roman" w:hAnsi="Times New Roman"/>
+                <w:sz w:val="26"/>
+                <w:szCs w:val="26"/>
+              </w:rPr>
+            </w:pPr>
+            <w:r/>
+            <w:r>
+              <w:rPr>
+                <w:rFonts w:ascii="Times New Roman" w:cs="Times New Roman" w:eastAsia="Times New Roman" w:hAnsi="Times New Roman"/>
+                <w:b w:val="0"/>
+                <w:sz w:val="26"/>
+                <w:szCs w:val="26"/>
+                <w:rtl w:val="0"/>
+              </w:rPr>
+              <w:t>Trang Ưu đãi phản ánh đúng chiến dịch đang chạy</w:t>
+            </w:r>
+          </w:p>
+        </w:tc>
+        <w:tc>
+          <w:tcPr>
+            <w:tcW w:type="dxa" w:w="2235"/>
+          </w:tcPr>
+          <w:p>
+            <w:pPr>
+              <w:shd w:fill="ffffff" w:val="clear"/>
+              <w:spacing w:before="200" w:line="360" w:lineRule="auto"/>
+              <w:jc w:val="both"/>
+              <w:rPr>
+                <w:rFonts w:ascii="Times New Roman" w:cs="Times New Roman" w:eastAsia="Times New Roman" w:hAnsi="Times New Roman"/>
+                <w:sz w:val="26"/>
+                <w:szCs w:val="26"/>
+              </w:rPr>
+            </w:pPr>
+            <w:r/>
+            <w:r>
+              <w:rPr>
+                <w:rFonts w:ascii="Times New Roman" w:cs="Times New Roman" w:eastAsia="Times New Roman" w:hAnsi="Times New Roman"/>
+                <w:b w:val="0"/>
+                <w:sz w:val="26"/>
+                <w:szCs w:val="26"/>
+                <w:rtl w:val="0"/>
+              </w:rPr>
+              <w:t>Trang Ưu đãi hiển thị các chiến dịch đang trong khung thời gian và đang bật, nhóm theo ưu đãi dành riêng cho khách, ưu đãi đang diễn ra và ưu đãi sắp hết hạn.</w:t>
             </w:r>
           </w:p>
         </w:tc>
@@ -3389,7 +3389,7 @@
                 <w:szCs w:val="26"/>
                 <w:rtl w:val="0"/>
               </w:rPr>
-              <w:t>Tổng hợp tỉ lệ dùng mã, doanh thu từ đơn có mã, giá trị đơn trung bình có mã so với không mã và so sánh giữa các chiến dịch. Cho phép xuất báo cáo.</w:t>
+              <w:t>Đọc trực tiếp từ dữ liệu chiến dịch, không dùng nội dung viết cứng trong mã nguồn. Chiến dịch bị tạm dừng hoặc đã kết thúc thì biến mất khỏi trang khách ở lần tải kế tiếp.</w:t>
             </w:r>
           </w:p>
         </w:tc>
@@ -3419,6 +3419,348 @@
                 <w:szCs w:val="26"/>
                 <w:rtl w:val="0"/>
               </w:rPr>
+              <w:t>AD_COMBO_01</w:t>
+            </w:r>
+          </w:p>
+        </w:tc>
+        <w:tc>
+          <w:tcPr>
+            <w:tcW w:type="dxa" w:w="2235"/>
+          </w:tcPr>
+          <w:p>
+            <w:pPr>
+              <w:shd w:fill="ffffff" w:val="clear"/>
+              <w:spacing w:before="200" w:line="360" w:lineRule="auto"/>
+              <w:jc w:val="both"/>
+              <w:rPr>
+                <w:rFonts w:ascii="Times New Roman" w:cs="Times New Roman" w:eastAsia="Times New Roman" w:hAnsi="Times New Roman"/>
+                <w:sz w:val="26"/>
+                <w:szCs w:val="26"/>
+              </w:rPr>
+            </w:pPr>
+            <w:r/>
+            <w:r>
+              <w:rPr>
+                <w:rFonts w:ascii="Times New Roman" w:cs="Times New Roman" w:eastAsia="Times New Roman" w:hAnsi="Times New Roman"/>
+                <w:b w:val="0"/>
+                <w:sz w:val="26"/>
+                <w:szCs w:val="26"/>
+                <w:rtl w:val="0"/>
+              </w:rPr>
+              <w:t>Giá combo thấp hơn tổng giá lẻ</w:t>
+            </w:r>
+          </w:p>
+        </w:tc>
+        <w:tc>
+          <w:tcPr>
+            <w:tcW w:type="dxa" w:w="2235"/>
+          </w:tcPr>
+          <w:p>
+            <w:pPr>
+              <w:shd w:fill="ffffff" w:val="clear"/>
+              <w:spacing w:before="200" w:line="360" w:lineRule="auto"/>
+              <w:jc w:val="both"/>
+              <w:rPr>
+                <w:rFonts w:ascii="Times New Roman" w:cs="Times New Roman" w:eastAsia="Times New Roman" w:hAnsi="Times New Roman"/>
+                <w:sz w:val="26"/>
+                <w:szCs w:val="26"/>
+              </w:rPr>
+            </w:pPr>
+            <w:r/>
+            <w:r>
+              <w:rPr>
+                <w:rFonts w:ascii="Times New Roman" w:cs="Times New Roman" w:eastAsia="Times New Roman" w:hAnsi="Times New Roman"/>
+                <w:b w:val="0"/>
+                <w:sz w:val="26"/>
+                <w:szCs w:val="26"/>
+                <w:rtl w:val="0"/>
+              </w:rPr>
+              <w:t>Giá của một combo phải thấp hơn tổng giá bán hiện hành của các sản phẩm thành phần.</w:t>
+            </w:r>
+          </w:p>
+        </w:tc>
+        <w:tc>
+          <w:tcPr>
+            <w:tcW w:type="dxa" w:w="2340"/>
+          </w:tcPr>
+          <w:p>
+            <w:pPr>
+              <w:shd w:fill="ffffff" w:val="clear"/>
+              <w:spacing w:before="200" w:line="360" w:lineRule="auto"/>
+              <w:jc w:val="both"/>
+              <w:rPr>
+                <w:rFonts w:ascii="Times New Roman" w:cs="Times New Roman" w:eastAsia="Times New Roman" w:hAnsi="Times New Roman"/>
+                <w:sz w:val="26"/>
+                <w:szCs w:val="26"/>
+              </w:rPr>
+            </w:pPr>
+            <w:r/>
+            <w:r>
+              <w:rPr>
+                <w:rFonts w:ascii="Times New Roman" w:cs="Times New Roman" w:eastAsia="Times New Roman" w:hAnsi="Times New Roman"/>
+                <w:b w:val="0"/>
+                <w:sz w:val="26"/>
+                <w:szCs w:val="26"/>
+                <w:rtl w:val="0"/>
+              </w:rPr>
+              <w:t>Tự động tính tổng giá lẻ khi tạo combo và cảnh báo nếu mức chênh không đạt tối thiểu 5%.</w:t>
+            </w:r>
+          </w:p>
+        </w:tc>
+      </w:tr>
+      <w:tr>
+        <w:tc>
+          <w:tcPr>
+            <w:tcW w:type="dxa" w:w="2235"/>
+          </w:tcPr>
+          <w:p>
+            <w:pPr>
+              <w:shd w:fill="ffffff" w:val="clear"/>
+              <w:spacing w:before="200" w:line="360" w:lineRule="auto"/>
+              <w:jc w:val="both"/>
+              <w:rPr>
+                <w:rFonts w:ascii="Times New Roman" w:cs="Times New Roman" w:eastAsia="Times New Roman" w:hAnsi="Times New Roman"/>
+                <w:sz w:val="26"/>
+                <w:szCs w:val="26"/>
+              </w:rPr>
+            </w:pPr>
+            <w:r/>
+            <w:r>
+              <w:rPr>
+                <w:rFonts w:ascii="Times New Roman" w:cs="Times New Roman" w:eastAsia="Times New Roman" w:hAnsi="Times New Roman"/>
+                <w:b/>
+                <w:sz w:val="26"/>
+                <w:szCs w:val="26"/>
+                <w:rtl w:val="0"/>
+              </w:rPr>
+              <w:t>AD_COMBO_02</w:t>
+            </w:r>
+          </w:p>
+        </w:tc>
+        <w:tc>
+          <w:tcPr>
+            <w:tcW w:type="dxa" w:w="2235"/>
+          </w:tcPr>
+          <w:p>
+            <w:pPr>
+              <w:shd w:fill="ffffff" w:val="clear"/>
+              <w:spacing w:before="200" w:line="360" w:lineRule="auto"/>
+              <w:jc w:val="both"/>
+              <w:rPr>
+                <w:rFonts w:ascii="Times New Roman" w:cs="Times New Roman" w:eastAsia="Times New Roman" w:hAnsi="Times New Roman"/>
+                <w:sz w:val="26"/>
+                <w:szCs w:val="26"/>
+              </w:rPr>
+            </w:pPr>
+            <w:r/>
+            <w:r>
+              <w:rPr>
+                <w:rFonts w:ascii="Times New Roman" w:cs="Times New Roman" w:eastAsia="Times New Roman" w:hAnsi="Times New Roman"/>
+                <w:b w:val="0"/>
+                <w:sz w:val="26"/>
+                <w:szCs w:val="26"/>
+                <w:rtl w:val="0"/>
+              </w:rPr>
+              <w:t>Combo phân rã thành dòng hàng theo biến thể</w:t>
+            </w:r>
+          </w:p>
+        </w:tc>
+        <w:tc>
+          <w:tcPr>
+            <w:tcW w:type="dxa" w:w="2235"/>
+          </w:tcPr>
+          <w:p>
+            <w:pPr>
+              <w:shd w:fill="ffffff" w:val="clear"/>
+              <w:spacing w:before="200" w:line="360" w:lineRule="auto"/>
+              <w:jc w:val="both"/>
+              <w:rPr>
+                <w:rFonts w:ascii="Times New Roman" w:cs="Times New Roman" w:eastAsia="Times New Roman" w:hAnsi="Times New Roman"/>
+                <w:sz w:val="26"/>
+                <w:szCs w:val="26"/>
+              </w:rPr>
+            </w:pPr>
+            <w:r/>
+            <w:r>
+              <w:rPr>
+                <w:rFonts w:ascii="Times New Roman" w:cs="Times New Roman" w:eastAsia="Times New Roman" w:hAnsi="Times New Roman"/>
+                <w:b w:val="0"/>
+                <w:sz w:val="26"/>
+                <w:szCs w:val="26"/>
+                <w:rtl w:val="0"/>
+              </w:rPr>
+              <w:t>Combo không phải một mặt hàng riêng. Khi vào giỏ, combo được tách thành các dòng hàng, mỗi dòng mang mã biến thể thật và đơn giá catalog của sản phẩm thành phần.</w:t>
+            </w:r>
+          </w:p>
+        </w:tc>
+        <w:tc>
+          <w:tcPr>
+            <w:tcW w:type="dxa" w:w="2340"/>
+          </w:tcPr>
+          <w:p>
+            <w:pPr>
+              <w:shd w:fill="ffffff" w:val="clear"/>
+              <w:spacing w:before="200" w:line="360" w:lineRule="auto"/>
+              <w:jc w:val="both"/>
+              <w:rPr>
+                <w:rFonts w:ascii="Times New Roman" w:cs="Times New Roman" w:eastAsia="Times New Roman" w:hAnsi="Times New Roman"/>
+                <w:sz w:val="26"/>
+                <w:szCs w:val="26"/>
+              </w:rPr>
+            </w:pPr>
+            <w:r/>
+            <w:r>
+              <w:rPr>
+                <w:rFonts w:ascii="Times New Roman" w:cs="Times New Roman" w:eastAsia="Times New Roman" w:hAnsi="Times New Roman"/>
+                <w:b w:val="0"/>
+                <w:sz w:val="26"/>
+                <w:szCs w:val="26"/>
+                <w:rtl w:val="0"/>
+              </w:rPr>
+              <w:t>Áp cùng một quy tắc tính tiền như đơn thường, không cần ngoại lệ cho combo. Tồn kho trừ đúng tới từng biến thể sau khi đơn được xác nhận.</w:t>
+            </w:r>
+          </w:p>
+        </w:tc>
+      </w:tr>
+      <w:tr>
+        <w:tc>
+          <w:tcPr>
+            <w:tcW w:type="dxa" w:w="2235"/>
+          </w:tcPr>
+          <w:p>
+            <w:pPr>
+              <w:shd w:fill="ffffff" w:val="clear"/>
+              <w:spacing w:before="200" w:line="360" w:lineRule="auto"/>
+              <w:jc w:val="both"/>
+              <w:rPr>
+                <w:rFonts w:ascii="Times New Roman" w:cs="Times New Roman" w:eastAsia="Times New Roman" w:hAnsi="Times New Roman"/>
+                <w:sz w:val="26"/>
+                <w:szCs w:val="26"/>
+              </w:rPr>
+            </w:pPr>
+            <w:r/>
+            <w:r>
+              <w:rPr>
+                <w:rFonts w:ascii="Times New Roman" w:cs="Times New Roman" w:eastAsia="Times New Roman" w:hAnsi="Times New Roman"/>
+                <w:b/>
+                <w:sz w:val="26"/>
+                <w:szCs w:val="26"/>
+                <w:rtl w:val="0"/>
+              </w:rPr>
+              <w:t>AD_STATS_01</w:t>
+            </w:r>
+          </w:p>
+        </w:tc>
+        <w:tc>
+          <w:tcPr>
+            <w:tcW w:type="dxa" w:w="2235"/>
+          </w:tcPr>
+          <w:p>
+            <w:pPr>
+              <w:shd w:fill="ffffff" w:val="clear"/>
+              <w:spacing w:before="200" w:line="360" w:lineRule="auto"/>
+              <w:jc w:val="both"/>
+              <w:rPr>
+                <w:rFonts w:ascii="Times New Roman" w:cs="Times New Roman" w:eastAsia="Times New Roman" w:hAnsi="Times New Roman"/>
+                <w:sz w:val="26"/>
+                <w:szCs w:val="26"/>
+              </w:rPr>
+            </w:pPr>
+            <w:r/>
+            <w:r>
+              <w:rPr>
+                <w:rFonts w:ascii="Times New Roman" w:cs="Times New Roman" w:eastAsia="Times New Roman" w:hAnsi="Times New Roman"/>
+                <w:b w:val="0"/>
+                <w:sz w:val="26"/>
+                <w:szCs w:val="26"/>
+                <w:rtl w:val="0"/>
+              </w:rPr>
+              <w:t>Thống kê đọc từ đơn hàng thật</w:t>
+            </w:r>
+          </w:p>
+        </w:tc>
+        <w:tc>
+          <w:tcPr>
+            <w:tcW w:type="dxa" w:w="2235"/>
+          </w:tcPr>
+          <w:p>
+            <w:pPr>
+              <w:shd w:fill="ffffff" w:val="clear"/>
+              <w:spacing w:before="200" w:line="360" w:lineRule="auto"/>
+              <w:jc w:val="both"/>
+              <w:rPr>
+                <w:rFonts w:ascii="Times New Roman" w:cs="Times New Roman" w:eastAsia="Times New Roman" w:hAnsi="Times New Roman"/>
+                <w:sz w:val="26"/>
+                <w:szCs w:val="26"/>
+              </w:rPr>
+            </w:pPr>
+            <w:r/>
+            <w:r>
+              <w:rPr>
+                <w:rFonts w:ascii="Times New Roman" w:cs="Times New Roman" w:eastAsia="Times New Roman" w:hAnsi="Times New Roman"/>
+                <w:b w:val="0"/>
+                <w:sz w:val="26"/>
+                <w:szCs w:val="26"/>
+                <w:rtl w:val="0"/>
+              </w:rPr>
+              <w:t>Các chỉ số hiệu quả khuyến mãi được tính từ bảng đơn hàng, không phải từ số dòng trong bảng chiến dịch hay bảng mã.</w:t>
+            </w:r>
+          </w:p>
+        </w:tc>
+        <w:tc>
+          <w:tcPr>
+            <w:tcW w:type="dxa" w:w="2340"/>
+          </w:tcPr>
+          <w:p>
+            <w:pPr>
+              <w:shd w:fill="ffffff" w:val="clear"/>
+              <w:spacing w:before="200" w:line="360" w:lineRule="auto"/>
+              <w:jc w:val="both"/>
+              <w:rPr>
+                <w:rFonts w:ascii="Times New Roman" w:cs="Times New Roman" w:eastAsia="Times New Roman" w:hAnsi="Times New Roman"/>
+                <w:sz w:val="26"/>
+                <w:szCs w:val="26"/>
+              </w:rPr>
+            </w:pPr>
+            <w:r/>
+            <w:r>
+              <w:rPr>
+                <w:rFonts w:ascii="Times New Roman" w:cs="Times New Roman" w:eastAsia="Times New Roman" w:hAnsi="Times New Roman"/>
+                <w:b w:val="0"/>
+                <w:sz w:val="26"/>
+                <w:szCs w:val="26"/>
+                <w:rtl w:val="0"/>
+              </w:rPr>
+              <w:t>Tổng hợp tỉ lệ dùng mã, doanh thu từ đơn có mã, giá trị đơn trung bình có mã so với không mã và so sánh giữa các chiến dịch. Cho phép xuất báo cáo.</w:t>
+            </w:r>
+          </w:p>
+        </w:tc>
+      </w:tr>
+      <w:tr>
+        <w:tc>
+          <w:tcPr>
+            <w:tcW w:type="dxa" w:w="2235"/>
+          </w:tcPr>
+          <w:p>
+            <w:pPr>
+              <w:shd w:fill="ffffff" w:val="clear"/>
+              <w:spacing w:before="200" w:line="360" w:lineRule="auto"/>
+              <w:jc w:val="both"/>
+              <w:rPr>
+                <w:rFonts w:ascii="Times New Roman" w:cs="Times New Roman" w:eastAsia="Times New Roman" w:hAnsi="Times New Roman"/>
+                <w:sz w:val="26"/>
+                <w:szCs w:val="26"/>
+              </w:rPr>
+            </w:pPr>
+            <w:r/>
+            <w:r>
+              <w:rPr>
+                <w:rFonts w:ascii="Times New Roman" w:cs="Times New Roman" w:eastAsia="Times New Roman" w:hAnsi="Times New Roman"/>
+                <w:b/>
+                <w:sz w:val="26"/>
+                <w:szCs w:val="26"/>
+                <w:rtl w:val="0"/>
+              </w:rPr>
               <w:t>AD_STATS_02</w:t>
             </w:r>
           </w:p>
@@ -3934,7 +4276,7 @@
           <w:szCs w:val="26"/>
           <w:rtl w:val="0"/>
         </w:rPr>
-        <w:t>Cách xử lý: Việc ghi lượt dùng khoá dòng mã nên hai yêu cầu xếp hàng. Yêu cầu đầu tiên nhận lượt cuối. Yêu cầu thứ hai bị từ chối ở bước chấm lại mã với lý do mã đã hết lượt, và khách được mời chọn mã khác trong ví.</w:t>
+        <w:t>Cách xử lý: Việc ghi lượt dùng khoá dòng mã nên hai yêu cầu xếp hàng. Yêu cầu đầu tiên nhận lượt cuối. Yêu cầu thứ hai không tạo đơn: hệ thống báo mã vừa hết lượt, đưa ra mã thay thế tốt nhất cùng tổng tiền mới, và đơn chỉ được tạo khi khách xác nhận lại. Với khách vãng lai đặt hàng bằng mã xác thực gửi qua email, mã xác thực đó vẫn dùng lại được cho lần xác nhận này.</w:t>
       </w:r>
     </w:p>
     <w:p>
@@ -3954,7 +4296,7 @@
           <w:szCs w:val="26"/>
           <w:rtl w:val="0"/>
         </w:rPr>
-        <w:t>Tình huống 8: Khách huỷ đơn đã áp mã</w:t>
+        <w:t>Tình huống 8: Đơn đã áp mã không thành</w:t>
       </w:r>
     </w:p>
     <w:p>
@@ -3974,7 +4316,7 @@
           <w:szCs w:val="26"/>
           <w:rtl w:val="0"/>
         </w:rPr>
-        <w:t>Mô tả: Một đơn đã ghi nhận lượt dùng mã và đã cộng ngân sách chiến dịch, sau đó bị huỷ.</w:t>
+        <w:t>Mô tả: Một đơn đã ghi nhận lượt dùng mã và đã cộng ngân sách chiến dịch, sau đó bị khách hoặc quản trị viên huỷ, hoặc khách bỏ ngang trang thanh toán trực tuyến cho tới khi phiên hết hạn. Cùng một đơn có thể đi qua hai đường, chẳng hạn phiên thanh toán hết hạn rồi quản trị viên huỷ đơn.</w:t>
       </w:r>
     </w:p>
     <w:p>
@@ -3994,7 +4336,7 @@
           <w:szCs w:val="26"/>
           <w:rtl w:val="0"/>
         </w:rPr>
-        <w:t>Cách xử lý: Hệ thống trả lại một lượt dùng cho mã và trừ đúng phần ngân sách đã cộng của đơn đó. Nếu chiến dịch trước đó đã dừng vì chạm trần, việc hoàn lại không tự bật lại chiến dịch; quản trị viên quyết định có kích hoạt lại hay không.</w:t>
+        <w:t>Cách xử lý: Hệ thống trả lại một lượt dùng cho mã và trừ đúng phần ngân sách đã cộng của đơn đó, đúng một lần dù đơn đi qua bao nhiêu đường kết thúc. Nếu chiến dịch trước đó đã dừng vì chạm trần, việc hoàn lại không tự bật lại chiến dịch; quản trị viên quyết định có kích hoạt lại hay không.</w:t>
       </w:r>
     </w:p>
     <w:p>
@@ -4115,6 +4457,66 @@
           <w:rtl w:val="0"/>
         </w:rPr>
         <w:t>Cách xử lý: Trường hợp ngừng kinh doanh, hệ thống vô hiệu hoá combo và báo quản trị viên cập nhật lại danh sách thành phần. Trường hợp hết tồn, hệ thống chuyển combo sang tạm hết hàng và ẩn nút thêm vào giỏ, đồng thời cảnh báo thiếu hụt tồn kho trên trang quản trị. Combo trở lại bán được ngay khi thành phần đó có tồn trở lại.</w:t>
+      </w:r>
+    </w:p>
+    <w:p>
+      <w:pPr>
+        <w:spacing w:after="160" w:before="200" w:line="360" w:lineRule="auto"/>
+        <w:jc w:val="both"/>
+        <w:rPr>
+          <w:rFonts w:ascii="Times New Roman" w:cs="Times New Roman" w:eastAsia="Times New Roman" w:hAnsi="Times New Roman"/>
+          <w:sz w:val="26"/>
+          <w:szCs w:val="26"/>
+        </w:rPr>
+      </w:pPr>
+      <w:r>
+        <w:rPr>
+          <w:rFonts w:ascii="Times New Roman" w:cs="Times New Roman" w:eastAsia="Times New Roman" w:hAnsi="Times New Roman"/>
+          <w:sz w:val="26"/>
+          <w:szCs w:val="26"/>
+          <w:rtl w:val="0"/>
+        </w:rPr>
+        <w:t>Tình huống 11: Mã theo danh mục trên giỏ hàng lẫn nhiều danh mục</w:t>
+      </w:r>
+    </w:p>
+    <w:p>
+      <w:pPr>
+        <w:spacing w:after="160" w:before="200" w:line="360" w:lineRule="auto"/>
+        <w:jc w:val="both"/>
+        <w:rPr>
+          <w:rFonts w:ascii="Times New Roman" w:cs="Times New Roman" w:eastAsia="Times New Roman" w:hAnsi="Times New Roman"/>
+          <w:sz w:val="26"/>
+          <w:szCs w:val="26"/>
+        </w:rPr>
+      </w:pPr>
+      <w:r>
+        <w:rPr>
+          <w:rFonts w:ascii="Times New Roman" w:cs="Times New Roman" w:eastAsia="Times New Roman" w:hAnsi="Times New Roman"/>
+          <w:sz w:val="26"/>
+          <w:szCs w:val="26"/>
+          <w:rtl w:val="0"/>
+        </w:rPr>
+        <w:t>Mô tả: Mã giảm 20% chỉ cho danh mục Áo, đơn tối thiểu 400.000đ. Giỏ hàng có một áo 300.000đ và một quần 500.000đ, tổng giỏ 800.000đ.</w:t>
+      </w:r>
+    </w:p>
+    <w:p>
+      <w:pPr>
+        <w:spacing w:after="160" w:before="200" w:line="360" w:lineRule="auto"/>
+        <w:jc w:val="both"/>
+        <w:rPr>
+          <w:rFonts w:ascii="Times New Roman" w:cs="Times New Roman" w:eastAsia="Times New Roman" w:hAnsi="Times New Roman"/>
+          <w:sz w:val="26"/>
+          <w:szCs w:val="26"/>
+        </w:rPr>
+      </w:pPr>
+      <w:r>
+        <w:rPr>
+          <w:rFonts w:ascii="Times New Roman" w:cs="Times New Roman" w:eastAsia="Times New Roman" w:hAnsi="Times New Roman"/>
+          <w:sz w:val="26"/>
+          <w:szCs w:val="26"/>
+          <w:rtl w:val="0"/>
+        </w:rPr>
+        <w:t>Cách xử lý: Hệ thống chỉ tính phần hàng thuộc danh mục Áo là 300.000đ, chưa đạt mức tối thiểu, nên mã được báo là chưa đủ điều kiện kèm số tiền cần mua thêm trong danh mục Áo. Nếu mã không đặt mức tối thiểu thì số tiền giảm là 20% của 300.000đ, tức 60.000đ, không phải 20% của cả giỏ. Giỏ chỉ có quần thì mã được báo là sai danh mục.</w:t>
       </w:r>
     </w:p>
     <w:sectPr>

</xml_diff>

<commit_message>
docs(KAN-53): trả lượt mã khi đơn bị huỷ, không khi phiên thanh toán hết hạn
Theo OPEN-05 của A1, phiên Stripe hết hạn không làm đơn thất bại: đơn giữ Chờ
thanh toán 24 giờ để khách thanh toán lại với đúng mức giảm. Lượt mã và ngân
sách chỉ trả khi đơn thật sự bị huỷ (khách, admin, hoặc hệ thống tự huỷ sau 24
giờ). Sửa đoạn Hình 3.20, AD_ORDER_06, Tình huống 8 và ghi chú trên hình.

Co-Authored-By: Claude Opus 5.5 <noreply@anthropic.com>
</commit_message>
<xml_diff>
--- a/docs/ba/Velura-3.1.13-Quy-trinh-khuyen-mai.docx
+++ b/docs/ba/Velura-3.1.13-Quy-trinh-khuyen-mai.docx
@@ -427,7 +427,7 @@
           <w:szCs w:val="26"/>
           <w:rtl w:val="0"/>
         </w:rPr>
-        <w:t>Khi khách bấm đặt hàng, máy chủ tự tra bảng giá theo từng biến thể, tự cộng tạm tính, tự xác định phí vận chuyển theo ngưỡng và chấm lại mã một lần nữa tại đúng thời điểm đặt đơn. Toàn bộ số tiền do trình duyệt gửi lên đều bị bỏ qua. Nếu đơn giá trình duyệt khai lệch so với bảng giá, đơn bị từ chối và khách được yêu cầu tải lại giỏ, vì khoảng lệch đó thường là dấu hiệu giá vừa thay đổi trong lúc khách còn đang ở giỏ hàng. Lượt dùng mã và phần ngân sách tương ứng được ghi trong cùng một giao dịch có khoá dòng, nên hai đơn đặt gần như cùng lúc không ghi đè số lượt của nhau. Nếu mã khách chọn vừa hết lượt hoặc hết hạn trong khoảng giữa lúc xem giỏ và lúc bấm đặt hàng, hệ thống không tạo đơn. Thay vào đó hệ thống chọn mã thay thế tốt nhất, tính lại tổng tiền và báo khách mã nào vừa mất hiệu lực; khách xác nhận tổng mới thì đơn mới được tạo. Cách làm này bảo đảm khách không bao giờ bị trừ tiền theo một con số khác với con số mình đã nhìn thấy. Đơn không thành, dù do khách huỷ, quản trị viên huỷ, hay phiên thanh toán trực tuyến hết hạn hoặc bị huỷ, đều được trả lại lượt dùng và phần ngân sách đã cộng. Mỗi đơn chỉ được trả đúng một lần, kể cả khi cùng một đơn đi qua nhiều đường kết thúc.</w:t>
+        <w:t>Khi khách bấm đặt hàng, máy chủ tự tra bảng giá theo từng biến thể, tự cộng tạm tính, tự xác định phí vận chuyển theo ngưỡng và chấm lại mã một lần nữa tại đúng thời điểm đặt đơn. Toàn bộ số tiền do trình duyệt gửi lên đều bị bỏ qua. Nếu đơn giá trình duyệt khai lệch so với bảng giá, đơn bị từ chối và khách được yêu cầu tải lại giỏ, vì khoảng lệch đó thường là dấu hiệu giá vừa thay đổi trong lúc khách còn đang ở giỏ hàng. Lượt dùng mã và phần ngân sách tương ứng được ghi trong cùng một giao dịch có khoá dòng, nên hai đơn đặt gần như cùng lúc không ghi đè số lượt của nhau. Nếu mã khách chọn vừa hết lượt hoặc hết hạn trong khoảng giữa lúc xem giỏ và lúc bấm đặt hàng, hệ thống không tạo đơn. Thay vào đó hệ thống chọn mã thay thế tốt nhất, tính lại tổng tiền và báo khách mã nào vừa mất hiệu lực; khách xác nhận tổng mới thì đơn mới được tạo. Cách làm này bảo đảm khách không bao giờ bị trừ tiền theo một con số khác với con số mình đã nhìn thấy. Với thanh toán trực tuyến, phiên thanh toán hết hạn chưa làm đơn thất bại: đơn giữ trạng thái Chờ thanh toán trong 24 giờ kể từ lúc đặt để khách thanh toán lại với đúng mức giảm đã thấy. Lượt dùng và phần ngân sách đã cộng chỉ được trả lại khi đơn thật sự bị huỷ, dù do khách huỷ, quản trị viên huỷ hay hệ thống tự huỷ vì quá 24 giờ chưa thanh toán. Mỗi đơn chỉ được trả đúng một lần, kể cả khi cùng một đơn đi qua nhiều đường kết thúc.</w:t>
       </w:r>
     </w:p>
     <w:p>
@@ -3247,7 +3247,7 @@
                 <w:szCs w:val="26"/>
                 <w:rtl w:val="0"/>
               </w:rPr>
-              <w:t>Đơn không thành thì lượt dùng mã và phần ngân sách chiến dịch được trả lại. Đơn không thành gồm khách huỷ, quản trị viên huỷ, phiên thanh toán trực tuyến hết hạn hoặc bị huỷ.</w:t>
+              <w:t>Đơn bị huỷ thì lượt dùng mã và phần ngân sách chiến dịch được trả lại. Đơn bị huỷ gồm khách huỷ, quản trị viên huỷ và hệ thống tự huỷ đơn trực tuyến quá 24 giờ chưa thanh toán.</w:t>
             </w:r>
           </w:p>
         </w:tc>
@@ -3275,7 +3275,7 @@
                 <w:szCs w:val="26"/>
                 <w:rtl w:val="0"/>
               </w:rPr>
-              <w:t>Đánh dấu thời điểm trả lượt trên đơn. Đơn đã được trả thì mọi lần gọi sau đều bỏ qua, kể cả khi cổng thanh toán gửi lại cùng một thông báo. Thẻ bị từ chối chưa tính là đơn không thành vì khách vẫn thử lại được trên cùng phiên thanh toán.</w:t>
+              <w:t>Việc trả lượt gắn với lúc đơn chuyển sang Đã huỷ và đánh dấu thời điểm trả trên đơn. Đơn đã được trả thì mọi lần sau đều bỏ qua. Phiên thanh toán hết hạn hay thẻ bị từ chối chưa làm đơn bị huỷ: đơn vẫn Chờ thanh toán và khách thanh toán lại được trong 24 giờ.</w:t>
             </w:r>
           </w:p>
         </w:tc>
@@ -4316,7 +4316,7 @@
           <w:szCs w:val="26"/>
           <w:rtl w:val="0"/>
         </w:rPr>
-        <w:t>Mô tả: Một đơn đã ghi nhận lượt dùng mã và đã cộng ngân sách chiến dịch, sau đó bị khách hoặc quản trị viên huỷ, hoặc khách bỏ ngang trang thanh toán trực tuyến cho tới khi phiên hết hạn. Cùng một đơn có thể đi qua hai đường, chẳng hạn phiên thanh toán hết hạn rồi quản trị viên huỷ đơn.</w:t>
+        <w:t>Mô tả: Một đơn đã ghi nhận lượt dùng mã và đã cộng ngân sách chiến dịch, sau đó bị khách hoặc quản trị viên huỷ, hoặc khách bỏ ngang trang thanh toán trực tuyến và không thanh toán lại trong 24 giờ nên hệ thống tự huỷ. Phiên thanh toán hết hạn thì đơn chưa bị huỷ và chưa trả lượt. Cùng một đơn có thể gặp hai yêu cầu huỷ gần như cùng lúc, chẳng hạn khách bấm huỷ đúng lúc hệ thống tự huỷ.</w:t>
       </w:r>
     </w:p>
     <w:p>

</xml_diff>

<commit_message>
KAN-66: dong bo checkout gio hang va mua ngay khong don sl, guest checkout thanh vien khong chan, qr timeout chuyen cod, bang chung doi tra va metadata admin
</commit_message>
<xml_diff>
--- a/docs/ba/Velura-3.1.13-Quy-trinh-khuyen-mai.docx
+++ b/docs/ba/Velura-3.1.13-Quy-trinh-khuyen-mai.docx
@@ -427,7 +427,7 @@
           <w:szCs w:val="26"/>
           <w:rtl w:val="0"/>
         </w:rPr>
-        <w:t>Khi khách bấm đặt hàng, máy chủ tự tra bảng giá theo từng biến thể, tự cộng tạm tính, tự xác định phí vận chuyển theo ngưỡng và chấm lại mã một lần nữa tại đúng thời điểm đặt đơn. Toàn bộ số tiền do trình duyệt gửi lên đều bị bỏ qua. Nếu đơn giá trình duyệt khai lệch so với bảng giá, đơn bị từ chối và khách được yêu cầu tải lại giỏ, vì khoảng lệch đó thường là dấu hiệu giá vừa thay đổi trong lúc khách còn đang ở giỏ hàng. Lượt dùng mã và phần ngân sách tương ứng được ghi trong cùng một giao dịch có khoá dòng, nên hai đơn đặt gần như cùng lúc không ghi đè số lượt của nhau. Nếu mã khách chọn vừa hết lượt hoặc hết hạn trong khoảng giữa lúc xem giỏ và lúc bấm đặt hàng, hệ thống không tạo đơn. Thay vào đó hệ thống chọn mã thay thế tốt nhất, tính lại tổng tiền và báo khách mã nào vừa mất hiệu lực; khách xác nhận tổng mới thì đơn mới được tạo. Cách làm này bảo đảm khách không bao giờ bị trừ tiền theo một con số khác với con số mình đã nhìn thấy. Với thanh toán trực tuyến, phiên thanh toán hết hạn chưa làm đơn thất bại: đơn giữ trạng thái Chờ thanh toán trong 24 giờ kể từ lúc đặt để khách thanh toán lại với đúng mức giảm đã thấy. Lượt dùng và phần ngân sách đã cộng chỉ được trả lại khi đơn thật sự bị huỷ, dù do khách huỷ, quản trị viên huỷ hay hệ thống tự huỷ vì quá 24 giờ chưa thanh toán. Mỗi đơn chỉ được trả đúng một lần, kể cả khi cùng một đơn đi qua nhiều đường kết thúc.</w:t>
+        <w:t>Khi khách bấm đặt hàng, máy chủ tự tra bảng giá theo từng biến thể, tự cộng tạm tính, tự xác định phí vận chuyển theo ngưỡng và chấm lại mã một lần nữa tại đúng thời điểm đặt đơn. Toàn bộ số tiền do trình duyệt gửi lên đều bị bỏ qua. Nếu đơn giá trình duyệt khai lệch so với bảng giá, đơn bị từ chối và khách được yêu cầu tải lại giỏ, vì khoảng lệch đó thường là dấu hiệu giá vừa thay đổi trong lúc khách còn đang ở giỏ hàng. Lượt dùng mã và phần ngân sách tương ứng được ghi trong cùng một giao dịch có khoá dòng, nên hai đơn đặt gần như cùng lúc không ghi đè số lượt của nhau. Nếu mã khách chọn vừa hết lượt hoặc hết hạn trong khoảng giữa lúc xem giỏ và lúc bấm đặt hàng, hệ thống không tạo đơn. Thay vào đó hệ thống chọn mã thay thế tốt nhất, tính lại tổng tiền và báo khách mã nào vừa mất hiệu lực; khách xác nhận tổng mới thì đơn mới được tạo. Cách làm này bảo đảm khách không bao giờ bị trừ tiền theo một con số khác với con số mình đã nhìn thấy. Đơn không thành, dù do khách huỷ, quản trị viên huỷ, hay phiên thanh toán trực tuyến hết hạn hoặc bị huỷ, đều được trả lại lượt dùng và phần ngân sách đã cộng. Mỗi đơn chỉ được trả đúng một lần, kể cả khi cùng một đơn đi qua nhiều đường kết thúc.</w:t>
       </w:r>
     </w:p>
     <w:p>
@@ -3247,7 +3247,7 @@
                 <w:szCs w:val="26"/>
                 <w:rtl w:val="0"/>
               </w:rPr>
-              <w:t>Đơn bị huỷ thì lượt dùng mã và phần ngân sách chiến dịch được trả lại. Đơn bị huỷ gồm khách huỷ, quản trị viên huỷ và hệ thống tự huỷ đơn trực tuyến quá 24 giờ chưa thanh toán.</w:t>
+              <w:t>Đơn không thành thì lượt dùng mã và phần ngân sách chiến dịch được trả lại. Đơn không thành gồm khách huỷ, quản trị viên huỷ, phiên thanh toán trực tuyến hết hạn hoặc bị huỷ.</w:t>
             </w:r>
           </w:p>
         </w:tc>
@@ -3275,7 +3275,7 @@
                 <w:szCs w:val="26"/>
                 <w:rtl w:val="0"/>
               </w:rPr>
-              <w:t>Việc trả lượt gắn với lúc đơn chuyển sang Đã huỷ và đánh dấu thời điểm trả trên đơn. Đơn đã được trả thì mọi lần sau đều bỏ qua. Phiên thanh toán hết hạn hay thẻ bị từ chối chưa làm đơn bị huỷ: đơn vẫn Chờ thanh toán và khách thanh toán lại được trong 24 giờ.</w:t>
+              <w:t>Đánh dấu thời điểm trả lượt trên đơn. Đơn đã được trả thì mọi lần gọi sau đều bỏ qua, kể cả khi cổng thanh toán gửi lại cùng một thông báo. Thẻ bị từ chối chưa tính là đơn không thành vì khách vẫn thử lại được trên cùng phiên thanh toán.</w:t>
             </w:r>
           </w:p>
         </w:tc>
@@ -4316,7 +4316,7 @@
           <w:szCs w:val="26"/>
           <w:rtl w:val="0"/>
         </w:rPr>
-        <w:t>Mô tả: Một đơn đã ghi nhận lượt dùng mã và đã cộng ngân sách chiến dịch, sau đó bị khách hoặc quản trị viên huỷ, hoặc khách bỏ ngang trang thanh toán trực tuyến và không thanh toán lại trong 24 giờ nên hệ thống tự huỷ. Phiên thanh toán hết hạn thì đơn chưa bị huỷ và chưa trả lượt. Cùng một đơn có thể gặp hai yêu cầu huỷ gần như cùng lúc, chẳng hạn khách bấm huỷ đúng lúc hệ thống tự huỷ.</w:t>
+        <w:t>Mô tả: Một đơn đã ghi nhận lượt dùng mã và đã cộng ngân sách chiến dịch, sau đó bị khách hoặc quản trị viên huỷ, hoặc khách bỏ ngang trang thanh toán trực tuyến cho tới khi phiên hết hạn. Cùng một đơn có thể đi qua hai đường, chẳng hạn phiên thanh toán hết hạn rồi quản trị viên huỷ đơn.</w:t>
       </w:r>
     </w:p>
     <w:p>

</xml_diff>